<commit_message>
Commiting course work for the lab in week 5. There are seperate py files for each task
</commit_message>
<xml_diff>
--- a/ST2_Week_5_Tutorial_Activities/Week_5_lab_report.docx
+++ b/ST2_Week_5_Tutorial_Activities/Week_5_lab_report.docx
@@ -4,10 +4,107 @@
   <w:body>
     <w:p>
       <w:pPr>
+        <w:pStyle w:val="Heading2"/>
         <w:rPr>
           <w:lang w:val="en-US"/>
         </w:rPr>
       </w:pPr>
+      <w:r>
+        <w:rPr>
+          <w:lang w:val="en-US"/>
+        </w:rPr>
+        <w:drawing>
+          <wp:anchor distT="0" distB="0" distL="114300" distR="114300" simplePos="0" relativeHeight="251661312" behindDoc="0" locked="0" layoutInCell="1" allowOverlap="1" wp14:anchorId="1002B889" wp14:editId="787D2AF1">
+            <wp:simplePos x="0" y="0"/>
+            <wp:positionH relativeFrom="margin">
+              <wp:posOffset>-190832</wp:posOffset>
+            </wp:positionH>
+            <wp:positionV relativeFrom="paragraph">
+              <wp:posOffset>4053095</wp:posOffset>
+            </wp:positionV>
+            <wp:extent cx="4362674" cy="3829247"/>
+            <wp:effectExtent l="0" t="0" r="0" b="0"/>
+            <wp:wrapTopAndBottom/>
+            <wp:docPr id="548833451" name="Picture 1"/>
+            <wp:cNvGraphicFramePr>
+              <a:graphicFrameLocks xmlns:a="http://schemas.openxmlformats.org/drawingml/2006/main" noChangeAspect="1"/>
+            </wp:cNvGraphicFramePr>
+            <a:graphic xmlns:a="http://schemas.openxmlformats.org/drawingml/2006/main">
+              <a:graphicData uri="http://schemas.openxmlformats.org/drawingml/2006/picture">
+                <pic:pic xmlns:pic="http://schemas.openxmlformats.org/drawingml/2006/picture">
+                  <pic:nvPicPr>
+                    <pic:cNvPr id="548833451" name=""/>
+                    <pic:cNvPicPr/>
+                  </pic:nvPicPr>
+                  <pic:blipFill>
+                    <a:blip r:embed="rId4"/>
+                    <a:stretch>
+                      <a:fillRect/>
+                    </a:stretch>
+                  </pic:blipFill>
+                  <pic:spPr>
+                    <a:xfrm>
+                      <a:off x="0" y="0"/>
+                      <a:ext cx="4362674" cy="3829247"/>
+                    </a:xfrm>
+                    <a:prstGeom prst="rect">
+                      <a:avLst/>
+                    </a:prstGeom>
+                  </pic:spPr>
+                </pic:pic>
+              </a:graphicData>
+            </a:graphic>
+          </wp:anchor>
+        </w:drawing>
+      </w:r>
+      <w:r>
+        <w:rPr>
+          <w:lang w:val="en-US"/>
+        </w:rPr>
+        <w:drawing>
+          <wp:anchor distT="0" distB="0" distL="114300" distR="114300" simplePos="0" relativeHeight="251659264" behindDoc="0" locked="0" layoutInCell="1" allowOverlap="1" wp14:anchorId="3580F4C6" wp14:editId="11ECDEA0">
+            <wp:simplePos x="0" y="0"/>
+            <wp:positionH relativeFrom="column">
+              <wp:posOffset>-32385</wp:posOffset>
+            </wp:positionH>
+            <wp:positionV relativeFrom="paragraph">
+              <wp:posOffset>427355</wp:posOffset>
+            </wp:positionV>
+            <wp:extent cx="3549650" cy="3200400"/>
+            <wp:effectExtent l="0" t="0" r="0" b="0"/>
+            <wp:wrapTopAndBottom/>
+            <wp:docPr id="727552299" name="Picture 1"/>
+            <wp:cNvGraphicFramePr>
+              <a:graphicFrameLocks xmlns:a="http://schemas.openxmlformats.org/drawingml/2006/main" noChangeAspect="1"/>
+            </wp:cNvGraphicFramePr>
+            <a:graphic xmlns:a="http://schemas.openxmlformats.org/drawingml/2006/main">
+              <a:graphicData uri="http://schemas.openxmlformats.org/drawingml/2006/picture">
+                <pic:pic xmlns:pic="http://schemas.openxmlformats.org/drawingml/2006/picture">
+                  <pic:nvPicPr>
+                    <pic:cNvPr id="727552299" name=""/>
+                    <pic:cNvPicPr/>
+                  </pic:nvPicPr>
+                  <pic:blipFill>
+                    <a:blip r:embed="rId5"/>
+                    <a:stretch>
+                      <a:fillRect/>
+                    </a:stretch>
+                  </pic:blipFill>
+                  <pic:spPr>
+                    <a:xfrm>
+                      <a:off x="0" y="0"/>
+                      <a:ext cx="3549650" cy="3200400"/>
+                    </a:xfrm>
+                    <a:prstGeom prst="rect">
+                      <a:avLst/>
+                    </a:prstGeom>
+                  </pic:spPr>
+                </pic:pic>
+              </a:graphicData>
+            </a:graphic>
+          </wp:anchor>
+        </w:drawing>
+      </w:r>
       <w:r>
         <w:rPr>
           <w:lang w:val="en-US"/>
@@ -21,6 +118,70 @@
           <w:lang w:val="en-US"/>
         </w:rPr>
       </w:pPr>
+    </w:p>
+    <w:p>
+      <w:pPr>
+        <w:pStyle w:val="Heading2"/>
+        <w:rPr>
+          <w:lang w:val="en-US"/>
+        </w:rPr>
+      </w:pPr>
+    </w:p>
+    <w:p>
+      <w:pPr>
+        <w:pStyle w:val="Heading2"/>
+        <w:rPr>
+          <w:lang w:val="en-US"/>
+        </w:rPr>
+      </w:pPr>
+      <w:r>
+        <w:rPr>
+          <w:lang w:val="en-US"/>
+        </w:rPr>
+        <w:drawing>
+          <wp:anchor distT="0" distB="0" distL="114300" distR="114300" simplePos="0" relativeHeight="251663360" behindDoc="0" locked="0" layoutInCell="1" allowOverlap="1" wp14:anchorId="5B5DFBFD" wp14:editId="34A4C1A6">
+            <wp:simplePos x="0" y="0"/>
+            <wp:positionH relativeFrom="column">
+              <wp:posOffset>46990</wp:posOffset>
+            </wp:positionH>
+            <wp:positionV relativeFrom="paragraph">
+              <wp:posOffset>483925</wp:posOffset>
+            </wp:positionV>
+            <wp:extent cx="2743341" cy="2311519"/>
+            <wp:effectExtent l="0" t="0" r="0" b="0"/>
+            <wp:wrapTopAndBottom/>
+            <wp:docPr id="953236572" name="Picture 1"/>
+            <wp:cNvGraphicFramePr>
+              <a:graphicFrameLocks xmlns:a="http://schemas.openxmlformats.org/drawingml/2006/main" noChangeAspect="1"/>
+            </wp:cNvGraphicFramePr>
+            <a:graphic xmlns:a="http://schemas.openxmlformats.org/drawingml/2006/main">
+              <a:graphicData uri="http://schemas.openxmlformats.org/drawingml/2006/picture">
+                <pic:pic xmlns:pic="http://schemas.openxmlformats.org/drawingml/2006/picture">
+                  <pic:nvPicPr>
+                    <pic:cNvPr id="953236572" name=""/>
+                    <pic:cNvPicPr/>
+                  </pic:nvPicPr>
+                  <pic:blipFill>
+                    <a:blip r:embed="rId6"/>
+                    <a:stretch>
+                      <a:fillRect/>
+                    </a:stretch>
+                  </pic:blipFill>
+                  <pic:spPr>
+                    <a:xfrm>
+                      <a:off x="0" y="0"/>
+                      <a:ext cx="2743341" cy="2311519"/>
+                    </a:xfrm>
+                    <a:prstGeom prst="rect">
+                      <a:avLst/>
+                    </a:prstGeom>
+                  </pic:spPr>
+                </pic:pic>
+              </a:graphicData>
+            </a:graphic>
+          </wp:anchor>
+        </w:drawing>
+      </w:r>
       <w:r>
         <w:rPr>
           <w:lang w:val="en-US"/>
@@ -34,6 +195,62 @@
           <w:lang w:val="en-US"/>
         </w:rPr>
       </w:pPr>
+    </w:p>
+    <w:p>
+      <w:pPr>
+        <w:pStyle w:val="Heading2"/>
+        <w:rPr>
+          <w:lang w:val="en-US"/>
+        </w:rPr>
+      </w:pPr>
+      <w:r>
+        <w:rPr>
+          <w:lang w:val="en-US"/>
+        </w:rPr>
+        <w:drawing>
+          <wp:anchor distT="0" distB="0" distL="114300" distR="114300" simplePos="0" relativeHeight="251665408" behindDoc="0" locked="0" layoutInCell="1" allowOverlap="1" wp14:anchorId="1524DA77" wp14:editId="3AE5FE6B">
+            <wp:simplePos x="0" y="0"/>
+            <wp:positionH relativeFrom="margin">
+              <wp:align>left</wp:align>
+            </wp:positionH>
+            <wp:positionV relativeFrom="paragraph">
+              <wp:posOffset>302371</wp:posOffset>
+            </wp:positionV>
+            <wp:extent cx="2209914" cy="1657435"/>
+            <wp:effectExtent l="0" t="0" r="0" b="0"/>
+            <wp:wrapTopAndBottom/>
+            <wp:docPr id="1046298255" name="Picture 1"/>
+            <wp:cNvGraphicFramePr>
+              <a:graphicFrameLocks xmlns:a="http://schemas.openxmlformats.org/drawingml/2006/main" noChangeAspect="1"/>
+            </wp:cNvGraphicFramePr>
+            <a:graphic xmlns:a="http://schemas.openxmlformats.org/drawingml/2006/main">
+              <a:graphicData uri="http://schemas.openxmlformats.org/drawingml/2006/picture">
+                <pic:pic xmlns:pic="http://schemas.openxmlformats.org/drawingml/2006/picture">
+                  <pic:nvPicPr>
+                    <pic:cNvPr id="1046298255" name=""/>
+                    <pic:cNvPicPr/>
+                  </pic:nvPicPr>
+                  <pic:blipFill>
+                    <a:blip r:embed="rId7"/>
+                    <a:stretch>
+                      <a:fillRect/>
+                    </a:stretch>
+                  </pic:blipFill>
+                  <pic:spPr>
+                    <a:xfrm>
+                      <a:off x="0" y="0"/>
+                      <a:ext cx="2209914" cy="1657435"/>
+                    </a:xfrm>
+                    <a:prstGeom prst="rect">
+                      <a:avLst/>
+                    </a:prstGeom>
+                  </pic:spPr>
+                </pic:pic>
+              </a:graphicData>
+            </a:graphic>
+          </wp:anchor>
+        </w:drawing>
+      </w:r>
       <w:r>
         <w:rPr>
           <w:lang w:val="en-US"/>
@@ -51,11 +268,124 @@
         <w:rPr>
           <w:lang w:val="en-US"/>
         </w:rPr>
+        <w:drawing>
+          <wp:anchor distT="0" distB="0" distL="114300" distR="114300" simplePos="0" relativeHeight="251669504" behindDoc="0" locked="0" layoutInCell="1" allowOverlap="1" wp14:anchorId="44CC1704" wp14:editId="7C621472">
+            <wp:simplePos x="0" y="0"/>
+            <wp:positionH relativeFrom="margin">
+              <wp:align>left</wp:align>
+            </wp:positionH>
+            <wp:positionV relativeFrom="paragraph">
+              <wp:posOffset>3728002</wp:posOffset>
+            </wp:positionV>
+            <wp:extent cx="1949550" cy="882695"/>
+            <wp:effectExtent l="0" t="0" r="0" b="0"/>
+            <wp:wrapTopAndBottom/>
+            <wp:docPr id="290336460" name="Picture 1"/>
+            <wp:cNvGraphicFramePr>
+              <a:graphicFrameLocks xmlns:a="http://schemas.openxmlformats.org/drawingml/2006/main" noChangeAspect="1"/>
+            </wp:cNvGraphicFramePr>
+            <a:graphic xmlns:a="http://schemas.openxmlformats.org/drawingml/2006/main">
+              <a:graphicData uri="http://schemas.openxmlformats.org/drawingml/2006/picture">
+                <pic:pic xmlns:pic="http://schemas.openxmlformats.org/drawingml/2006/picture">
+                  <pic:nvPicPr>
+                    <pic:cNvPr id="290336460" name=""/>
+                    <pic:cNvPicPr/>
+                  </pic:nvPicPr>
+                  <pic:blipFill>
+                    <a:blip r:embed="rId8"/>
+                    <a:stretch>
+                      <a:fillRect/>
+                    </a:stretch>
+                  </pic:blipFill>
+                  <pic:spPr>
+                    <a:xfrm>
+                      <a:off x="0" y="0"/>
+                      <a:ext cx="1949550" cy="882695"/>
+                    </a:xfrm>
+                    <a:prstGeom prst="rect">
+                      <a:avLst/>
+                    </a:prstGeom>
+                  </pic:spPr>
+                </pic:pic>
+              </a:graphicData>
+            </a:graphic>
+          </wp:anchor>
+        </w:drawing>
+      </w:r>
+      <w:r>
+        <w:rPr>
+          <w:lang w:val="en-US"/>
+        </w:rPr>
+        <w:drawing>
+          <wp:anchor distT="0" distB="0" distL="114300" distR="114300" simplePos="0" relativeHeight="251667456" behindDoc="0" locked="0" layoutInCell="1" allowOverlap="1" wp14:anchorId="139DA39D" wp14:editId="076D53AC">
+            <wp:simplePos x="0" y="0"/>
+            <wp:positionH relativeFrom="margin">
+              <wp:align>left</wp:align>
+            </wp:positionH>
+            <wp:positionV relativeFrom="paragraph">
+              <wp:posOffset>1807459</wp:posOffset>
+            </wp:positionV>
+            <wp:extent cx="1854295" cy="1682836"/>
+            <wp:effectExtent l="0" t="0" r="0" b="0"/>
+            <wp:wrapTopAndBottom/>
+            <wp:docPr id="1666302930" name="Picture 1"/>
+            <wp:cNvGraphicFramePr>
+              <a:graphicFrameLocks xmlns:a="http://schemas.openxmlformats.org/drawingml/2006/main" noChangeAspect="1"/>
+            </wp:cNvGraphicFramePr>
+            <a:graphic xmlns:a="http://schemas.openxmlformats.org/drawingml/2006/main">
+              <a:graphicData uri="http://schemas.openxmlformats.org/drawingml/2006/picture">
+                <pic:pic xmlns:pic="http://schemas.openxmlformats.org/drawingml/2006/picture">
+                  <pic:nvPicPr>
+                    <pic:cNvPr id="1666302930" name=""/>
+                    <pic:cNvPicPr/>
+                  </pic:nvPicPr>
+                  <pic:blipFill>
+                    <a:blip r:embed="rId9"/>
+                    <a:stretch>
+                      <a:fillRect/>
+                    </a:stretch>
+                  </pic:blipFill>
+                  <pic:spPr>
+                    <a:xfrm>
+                      <a:off x="0" y="0"/>
+                      <a:ext cx="1854295" cy="1682836"/>
+                    </a:xfrm>
+                    <a:prstGeom prst="rect">
+                      <a:avLst/>
+                    </a:prstGeom>
+                  </pic:spPr>
+                </pic:pic>
+              </a:graphicData>
+            </a:graphic>
+          </wp:anchor>
+        </w:drawing>
+      </w:r>
+    </w:p>
+    <w:p>
+      <w:pPr>
+        <w:rPr>
+          <w:lang w:val="en-US"/>
+        </w:rPr>
+      </w:pPr>
+    </w:p>
+    <w:p>
+      <w:pPr>
+        <w:pStyle w:val="Heading2"/>
+        <w:rPr>
+          <w:lang w:val="en-US"/>
+        </w:rPr>
+      </w:pPr>
+      <w:r>
+        <w:rPr>
+          <w:lang w:val="en-US"/>
+        </w:rPr>
+        <w:lastRenderedPageBreak/>
         <w:t>Task 4</w:t>
       </w:r>
     </w:p>
     <w:p>
       <w:pPr>
+        <w:pStyle w:val="Heading2"/>
         <w:rPr>
           <w:lang w:val="en-US"/>
         </w:rPr>
@@ -512,7 +842,6 @@
     <w:next w:val="Normal"/>
     <w:link w:val="Heading2Char"/>
     <w:uiPriority w:val="9"/>
-    <w:semiHidden/>
     <w:unhideWhenUsed/>
     <w:qFormat/>
     <w:rsid w:val="002B7524"/>
@@ -749,7 +1078,6 @@
     <w:basedOn w:val="DefaultParagraphFont"/>
     <w:link w:val="Heading2"/>
     <w:uiPriority w:val="9"/>
-    <w:semiHidden/>
     <w:rsid w:val="002B7524"/>
     <w:rPr>
       <w:rFonts w:asciiTheme="majorHAnsi" w:eastAsiaTheme="majorEastAsia" w:hAnsiTheme="majorHAnsi" w:cstheme="majorBidi"/>

</xml_diff>

<commit_message>
Commiting the last two py files for task 4
</commit_message>
<xml_diff>
--- a/ST2_Week_5_Tutorial_Activities/Week_5_lab_report.docx
+++ b/ST2_Week_5_Tutorial_Activities/Week_5_lab_report.docx
@@ -37,7 +37,7 @@
                     <pic:cNvPicPr/>
                   </pic:nvPicPr>
                   <pic:blipFill>
-                    <a:blip r:embed="rId4"/>
+                    <a:blip r:embed="rId6"/>
                     <a:stretch>
                       <a:fillRect/>
                     </a:stretch>
@@ -85,7 +85,7 @@
                     <pic:cNvPicPr/>
                   </pic:nvPicPr>
                   <pic:blipFill>
-                    <a:blip r:embed="rId5"/>
+                    <a:blip r:embed="rId7"/>
                     <a:stretch>
                       <a:fillRect/>
                     </a:stretch>
@@ -162,7 +162,7 @@
                     <pic:cNvPicPr/>
                   </pic:nvPicPr>
                   <pic:blipFill>
-                    <a:blip r:embed="rId6"/>
+                    <a:blip r:embed="rId8"/>
                     <a:stretch>
                       <a:fillRect/>
                     </a:stretch>
@@ -207,14 +207,97 @@
         <w:rPr>
           <w:lang w:val="en-US"/>
         </w:rPr>
+        <w:t>Task 3</w:t>
+      </w:r>
+    </w:p>
+    <w:p>
+      <w:pPr>
+        <w:rPr>
+          <w:lang w:val="en-US"/>
+        </w:rPr>
+      </w:pPr>
+    </w:p>
+    <w:p>
+      <w:pPr>
+        <w:rPr>
+          <w:lang w:val="en-US"/>
+        </w:rPr>
+      </w:pPr>
+    </w:p>
+    <w:p>
+      <w:pPr>
+        <w:rPr>
+          <w:lang w:val="en-US"/>
+        </w:rPr>
+      </w:pPr>
+    </w:p>
+    <w:p>
+      <w:pPr>
+        <w:rPr>
+          <w:lang w:val="en-US"/>
+        </w:rPr>
+      </w:pPr>
+    </w:p>
+    <w:p>
+      <w:pPr>
+        <w:rPr>
+          <w:lang w:val="en-US"/>
+        </w:rPr>
+      </w:pPr>
+    </w:p>
+    <w:p>
+      <w:pPr>
+        <w:rPr>
+          <w:lang w:val="en-US"/>
+        </w:rPr>
+      </w:pPr>
+    </w:p>
+    <w:p>
+      <w:pPr>
+        <w:rPr>
+          <w:lang w:val="en-US"/>
+        </w:rPr>
+      </w:pPr>
+    </w:p>
+    <w:p>
+      <w:pPr>
+        <w:rPr>
+          <w:lang w:val="en-US"/>
+        </w:rPr>
+      </w:pPr>
+    </w:p>
+    <w:p>
+      <w:pPr>
+        <w:rPr>
+          <w:lang w:val="en-US"/>
+        </w:rPr>
+      </w:pPr>
+    </w:p>
+    <w:p>
+      <w:pPr>
+        <w:rPr>
+          <w:lang w:val="en-US"/>
+        </w:rPr>
+      </w:pPr>
+    </w:p>
+    <w:p>
+      <w:pPr>
+        <w:rPr>
+          <w:lang w:val="en-US"/>
+        </w:rPr>
+      </w:pPr>
+      <w:r>
+        <w:rPr>
+          <w:lang w:val="en-US"/>
+        </w:rPr>
         <w:drawing>
-          <wp:anchor distT="0" distB="0" distL="114300" distR="114300" simplePos="0" relativeHeight="251665408" behindDoc="0" locked="0" layoutInCell="1" allowOverlap="1" wp14:anchorId="1524DA77" wp14:editId="3AE5FE6B">
+          <wp:anchor distT="0" distB="0" distL="114300" distR="114300" simplePos="0" relativeHeight="251665408" behindDoc="0" locked="0" layoutInCell="1" allowOverlap="1" wp14:anchorId="1524DA77" wp14:editId="3D05F620">
             <wp:simplePos x="0" y="0"/>
             <wp:positionH relativeFrom="margin">
-              <wp:align>left</wp:align>
+              <wp:posOffset>771001</wp:posOffset>
             </wp:positionH>
             <wp:positionV relativeFrom="paragraph">
-              <wp:posOffset>302371</wp:posOffset>
+              <wp:posOffset>405709</wp:posOffset>
             </wp:positionV>
             <wp:extent cx="2209914" cy="1657435"/>
             <wp:effectExtent l="0" t="0" r="0" b="0"/>
@@ -231,7 +314,7 @@
                     <pic:cNvPicPr/>
                   </pic:nvPicPr>
                   <pic:blipFill>
-                    <a:blip r:embed="rId7"/>
+                    <a:blip r:embed="rId9"/>
                     <a:stretch>
                       <a:fillRect/>
                     </a:stretch>
@@ -255,31 +338,18 @@
         <w:rPr>
           <w:lang w:val="en-US"/>
         </w:rPr>
-        <w:t>Task 3</w:t>
-      </w:r>
-    </w:p>
-    <w:p>
-      <w:pPr>
-        <w:rPr>
-          <w:lang w:val="en-US"/>
-        </w:rPr>
-      </w:pPr>
-      <w:r>
-        <w:rPr>
-          <w:lang w:val="en-US"/>
-        </w:rPr>
         <w:drawing>
-          <wp:anchor distT="0" distB="0" distL="114300" distR="114300" simplePos="0" relativeHeight="251669504" behindDoc="0" locked="0" layoutInCell="1" allowOverlap="1" wp14:anchorId="44CC1704" wp14:editId="7C621472">
+          <wp:anchor distT="0" distB="0" distL="114300" distR="114300" simplePos="0" relativeHeight="251669504" behindDoc="1" locked="0" layoutInCell="1" allowOverlap="1" wp14:anchorId="44CC1704" wp14:editId="48ACF41B">
             <wp:simplePos x="0" y="0"/>
             <wp:positionH relativeFrom="margin">
-              <wp:align>left</wp:align>
+              <wp:posOffset>3654839</wp:posOffset>
             </wp:positionH>
             <wp:positionV relativeFrom="paragraph">
-              <wp:posOffset>3728002</wp:posOffset>
+              <wp:posOffset>2016125</wp:posOffset>
             </wp:positionV>
             <wp:extent cx="1949550" cy="882695"/>
             <wp:effectExtent l="0" t="0" r="0" b="0"/>
-            <wp:wrapTopAndBottom/>
+            <wp:wrapNone/>
             <wp:docPr id="290336460" name="Picture 1"/>
             <wp:cNvGraphicFramePr>
               <a:graphicFrameLocks xmlns:a="http://schemas.openxmlformats.org/drawingml/2006/main" noChangeAspect="1"/>
@@ -292,7 +362,7 @@
                     <pic:cNvPicPr/>
                   </pic:nvPicPr>
                   <pic:blipFill>
-                    <a:blip r:embed="rId8"/>
+                    <a:blip r:embed="rId10"/>
                     <a:stretch>
                       <a:fillRect/>
                     </a:stretch>
@@ -317,13 +387,13 @@
           <w:lang w:val="en-US"/>
         </w:rPr>
         <w:drawing>
-          <wp:anchor distT="0" distB="0" distL="114300" distR="114300" simplePos="0" relativeHeight="251667456" behindDoc="0" locked="0" layoutInCell="1" allowOverlap="1" wp14:anchorId="139DA39D" wp14:editId="076D53AC">
+          <wp:anchor distT="0" distB="0" distL="114300" distR="114300" simplePos="0" relativeHeight="251667456" behindDoc="0" locked="0" layoutInCell="1" allowOverlap="1" wp14:anchorId="139DA39D" wp14:editId="03F4205B">
             <wp:simplePos x="0" y="0"/>
             <wp:positionH relativeFrom="margin">
-              <wp:align>left</wp:align>
+              <wp:posOffset>3688991</wp:posOffset>
             </wp:positionH>
             <wp:positionV relativeFrom="paragraph">
-              <wp:posOffset>1807459</wp:posOffset>
+              <wp:posOffset>334507</wp:posOffset>
             </wp:positionV>
             <wp:extent cx="1854295" cy="1682836"/>
             <wp:effectExtent l="0" t="0" r="0" b="0"/>
@@ -340,7 +410,7 @@
                     <pic:cNvPicPr/>
                   </pic:nvPicPr>
                   <pic:blipFill>
-                    <a:blip r:embed="rId9"/>
+                    <a:blip r:embed="rId11"/>
                     <a:stretch>
                       <a:fillRect/>
                     </a:stretch>
@@ -363,13 +433,6 @@
     </w:p>
     <w:p>
       <w:pPr>
-        <w:rPr>
-          <w:lang w:val="en-US"/>
-        </w:rPr>
-      </w:pPr>
-    </w:p>
-    <w:p>
-      <w:pPr>
         <w:pStyle w:val="Heading2"/>
         <w:rPr>
           <w:lang w:val="en-US"/>
@@ -385,7 +448,6 @@
     </w:p>
     <w:p>
       <w:pPr>
-        <w:pStyle w:val="Heading2"/>
         <w:rPr>
           <w:lang w:val="en-US"/>
         </w:rPr>
@@ -394,8 +456,479 @@
         <w:rPr>
           <w:lang w:val="en-US"/>
         </w:rPr>
-        <w:t>Task 5</w:t>
+        <w:t xml:space="preserve">Task 4.1 </w:t>
       </w:r>
+    </w:p>
+    <w:p>
+      <w:pPr>
+        <w:rPr>
+          <w:lang w:val="en-US"/>
+        </w:rPr>
+      </w:pPr>
+      <w:r>
+        <w:rPr>
+          <w:lang w:val="en-US"/>
+        </w:rPr>
+        <w:drawing>
+          <wp:anchor distT="0" distB="0" distL="114300" distR="114300" simplePos="0" relativeHeight="251675648" behindDoc="0" locked="0" layoutInCell="1" allowOverlap="1" wp14:anchorId="2791AB28" wp14:editId="0B040C58">
+            <wp:simplePos x="0" y="0"/>
+            <wp:positionH relativeFrom="column">
+              <wp:posOffset>968679</wp:posOffset>
+            </wp:positionH>
+            <wp:positionV relativeFrom="paragraph">
+              <wp:posOffset>5316717</wp:posOffset>
+            </wp:positionV>
+            <wp:extent cx="3772094" cy="2311519"/>
+            <wp:effectExtent l="0" t="0" r="0" b="0"/>
+            <wp:wrapTopAndBottom/>
+            <wp:docPr id="997324552" name="Picture 1"/>
+            <wp:cNvGraphicFramePr>
+              <a:graphicFrameLocks xmlns:a="http://schemas.openxmlformats.org/drawingml/2006/main" noChangeAspect="1"/>
+            </wp:cNvGraphicFramePr>
+            <a:graphic xmlns:a="http://schemas.openxmlformats.org/drawingml/2006/main">
+              <a:graphicData uri="http://schemas.openxmlformats.org/drawingml/2006/picture">
+                <pic:pic xmlns:pic="http://schemas.openxmlformats.org/drawingml/2006/picture">
+                  <pic:nvPicPr>
+                    <pic:cNvPr id="997324552" name=""/>
+                    <pic:cNvPicPr/>
+                  </pic:nvPicPr>
+                  <pic:blipFill>
+                    <a:blip r:embed="rId12"/>
+                    <a:stretch>
+                      <a:fillRect/>
+                    </a:stretch>
+                  </pic:blipFill>
+                  <pic:spPr>
+                    <a:xfrm>
+                      <a:off x="0" y="0"/>
+                      <a:ext cx="3772094" cy="2311519"/>
+                    </a:xfrm>
+                    <a:prstGeom prst="rect">
+                      <a:avLst/>
+                    </a:prstGeom>
+                  </pic:spPr>
+                </pic:pic>
+              </a:graphicData>
+            </a:graphic>
+          </wp:anchor>
+        </w:drawing>
+      </w:r>
+      <w:r>
+        <w:rPr>
+          <w:lang w:val="en-US"/>
+        </w:rPr>
+        <w:drawing>
+          <wp:anchor distT="0" distB="0" distL="114300" distR="114300" simplePos="0" relativeHeight="251673600" behindDoc="0" locked="0" layoutInCell="1" allowOverlap="1" wp14:anchorId="6D6CB7F5" wp14:editId="44384FAC">
+            <wp:simplePos x="0" y="0"/>
+            <wp:positionH relativeFrom="margin">
+              <wp:align>center</wp:align>
+            </wp:positionH>
+            <wp:positionV relativeFrom="paragraph">
+              <wp:posOffset>2694608</wp:posOffset>
+            </wp:positionV>
+            <wp:extent cx="3968954" cy="2349621"/>
+            <wp:effectExtent l="0" t="0" r="0" b="0"/>
+            <wp:wrapTopAndBottom/>
+            <wp:docPr id="1210333690" name="Picture 1"/>
+            <wp:cNvGraphicFramePr>
+              <a:graphicFrameLocks xmlns:a="http://schemas.openxmlformats.org/drawingml/2006/main" noChangeAspect="1"/>
+            </wp:cNvGraphicFramePr>
+            <a:graphic xmlns:a="http://schemas.openxmlformats.org/drawingml/2006/main">
+              <a:graphicData uri="http://schemas.openxmlformats.org/drawingml/2006/picture">
+                <pic:pic xmlns:pic="http://schemas.openxmlformats.org/drawingml/2006/picture">
+                  <pic:nvPicPr>
+                    <pic:cNvPr id="1210333690" name=""/>
+                    <pic:cNvPicPr/>
+                  </pic:nvPicPr>
+                  <pic:blipFill>
+                    <a:blip r:embed="rId13"/>
+                    <a:stretch>
+                      <a:fillRect/>
+                    </a:stretch>
+                  </pic:blipFill>
+                  <pic:spPr>
+                    <a:xfrm>
+                      <a:off x="0" y="0"/>
+                      <a:ext cx="3968954" cy="2349621"/>
+                    </a:xfrm>
+                    <a:prstGeom prst="rect">
+                      <a:avLst/>
+                    </a:prstGeom>
+                  </pic:spPr>
+                </pic:pic>
+              </a:graphicData>
+            </a:graphic>
+          </wp:anchor>
+        </w:drawing>
+      </w:r>
+    </w:p>
+    <w:p>
+      <w:pPr>
+        <w:rPr>
+          <w:lang w:val="en-US"/>
+        </w:rPr>
+      </w:pPr>
+      <w:r>
+        <w:rPr>
+          <w:lang w:val="en-US"/>
+        </w:rPr>
+        <w:drawing>
+          <wp:anchor distT="0" distB="0" distL="114300" distR="114300" simplePos="0" relativeHeight="251671552" behindDoc="0" locked="0" layoutInCell="1" allowOverlap="1" wp14:anchorId="08E98407" wp14:editId="704951A9">
+            <wp:simplePos x="0" y="0"/>
+            <wp:positionH relativeFrom="margin">
+              <wp:align>center</wp:align>
+            </wp:positionH>
+            <wp:positionV relativeFrom="paragraph">
+              <wp:posOffset>-552</wp:posOffset>
+            </wp:positionV>
+            <wp:extent cx="4369025" cy="2387723"/>
+            <wp:effectExtent l="0" t="0" r="0" b="0"/>
+            <wp:wrapTopAndBottom/>
+            <wp:docPr id="1390808399" name="Picture 1"/>
+            <wp:cNvGraphicFramePr>
+              <a:graphicFrameLocks xmlns:a="http://schemas.openxmlformats.org/drawingml/2006/main" noChangeAspect="1"/>
+            </wp:cNvGraphicFramePr>
+            <a:graphic xmlns:a="http://schemas.openxmlformats.org/drawingml/2006/main">
+              <a:graphicData uri="http://schemas.openxmlformats.org/drawingml/2006/picture">
+                <pic:pic xmlns:pic="http://schemas.openxmlformats.org/drawingml/2006/picture">
+                  <pic:nvPicPr>
+                    <pic:cNvPr id="1390808399" name=""/>
+                    <pic:cNvPicPr/>
+                  </pic:nvPicPr>
+                  <pic:blipFill>
+                    <a:blip r:embed="rId14"/>
+                    <a:stretch>
+                      <a:fillRect/>
+                    </a:stretch>
+                  </pic:blipFill>
+                  <pic:spPr>
+                    <a:xfrm>
+                      <a:off x="0" y="0"/>
+                      <a:ext cx="4369025" cy="2387723"/>
+                    </a:xfrm>
+                    <a:prstGeom prst="rect">
+                      <a:avLst/>
+                    </a:prstGeom>
+                  </pic:spPr>
+                </pic:pic>
+              </a:graphicData>
+            </a:graphic>
+          </wp:anchor>
+        </w:drawing>
+      </w:r>
+    </w:p>
+    <w:p>
+      <w:pPr>
+        <w:tabs>
+          <w:tab w:val="left" w:pos="2079"/>
+        </w:tabs>
+        <w:rPr>
+          <w:lang w:val="en-US"/>
+        </w:rPr>
+      </w:pPr>
+      <w:r>
+        <w:rPr>
+          <w:lang w:val="en-US"/>
+        </w:rPr>
+        <w:tab/>
+      </w:r>
+    </w:p>
+    <w:p>
+      <w:pPr>
+        <w:tabs>
+          <w:tab w:val="left" w:pos="2079"/>
+        </w:tabs>
+        <w:rPr>
+          <w:lang w:val="en-US"/>
+        </w:rPr>
+      </w:pPr>
+    </w:p>
+    <w:p>
+      <w:pPr>
+        <w:tabs>
+          <w:tab w:val="left" w:pos="2079"/>
+        </w:tabs>
+        <w:rPr>
+          <w:lang w:val="en-US"/>
+        </w:rPr>
+      </w:pPr>
+      <w:r>
+        <w:rPr>
+          <w:lang w:val="en-US"/>
+        </w:rPr>
+        <w:lastRenderedPageBreak/>
+        <w:t xml:space="preserve">Task 4.2 </w:t>
+      </w:r>
+    </w:p>
+    <w:p>
+      <w:pPr>
+        <w:tabs>
+          <w:tab w:val="left" w:pos="2079"/>
+        </w:tabs>
+        <w:rPr>
+          <w:lang w:val="en-US"/>
+        </w:rPr>
+      </w:pPr>
+      <w:r>
+        <w:rPr>
+          <w:lang w:val="en-US"/>
+        </w:rPr>
+        <w:drawing>
+          <wp:anchor distT="0" distB="0" distL="114300" distR="114300" simplePos="0" relativeHeight="251679744" behindDoc="0" locked="0" layoutInCell="1" allowOverlap="1" wp14:anchorId="5526D372" wp14:editId="599A2797">
+            <wp:simplePos x="0" y="0"/>
+            <wp:positionH relativeFrom="margin">
+              <wp:posOffset>2782239</wp:posOffset>
+            </wp:positionH>
+            <wp:positionV relativeFrom="paragraph">
+              <wp:posOffset>370536</wp:posOffset>
+            </wp:positionV>
+            <wp:extent cx="2790190" cy="3146425"/>
+            <wp:effectExtent l="0" t="0" r="0" b="0"/>
+            <wp:wrapTopAndBottom/>
+            <wp:docPr id="1995274691" name="Picture 1"/>
+            <wp:cNvGraphicFramePr>
+              <a:graphicFrameLocks xmlns:a="http://schemas.openxmlformats.org/drawingml/2006/main" noChangeAspect="1"/>
+            </wp:cNvGraphicFramePr>
+            <a:graphic xmlns:a="http://schemas.openxmlformats.org/drawingml/2006/main">
+              <a:graphicData uri="http://schemas.openxmlformats.org/drawingml/2006/picture">
+                <pic:pic xmlns:pic="http://schemas.openxmlformats.org/drawingml/2006/picture">
+                  <pic:nvPicPr>
+                    <pic:cNvPr id="1995274691" name=""/>
+                    <pic:cNvPicPr/>
+                  </pic:nvPicPr>
+                  <pic:blipFill>
+                    <a:blip r:embed="rId15"/>
+                    <a:stretch>
+                      <a:fillRect/>
+                    </a:stretch>
+                  </pic:blipFill>
+                  <pic:spPr>
+                    <a:xfrm>
+                      <a:off x="0" y="0"/>
+                      <a:ext cx="2790190" cy="3146425"/>
+                    </a:xfrm>
+                    <a:prstGeom prst="rect">
+                      <a:avLst/>
+                    </a:prstGeom>
+                  </pic:spPr>
+                </pic:pic>
+              </a:graphicData>
+            </a:graphic>
+            <wp14:sizeRelH relativeFrom="margin">
+              <wp14:pctWidth>0</wp14:pctWidth>
+            </wp14:sizeRelH>
+            <wp14:sizeRelV relativeFrom="margin">
+              <wp14:pctHeight>0</wp14:pctHeight>
+            </wp14:sizeRelV>
+          </wp:anchor>
+        </w:drawing>
+      </w:r>
+    </w:p>
+    <w:p>
+      <w:pPr>
+        <w:rPr>
+          <w:lang w:val="en-US"/>
+        </w:rPr>
+      </w:pPr>
+      <w:r>
+        <w:rPr>
+          <w:lang w:val="en-US"/>
+        </w:rPr>
+        <w:drawing>
+          <wp:anchor distT="0" distB="0" distL="114300" distR="114300" simplePos="0" relativeHeight="251677696" behindDoc="0" locked="0" layoutInCell="1" allowOverlap="1" wp14:anchorId="1CEBED9B" wp14:editId="456B82D1">
+            <wp:simplePos x="0" y="0"/>
+            <wp:positionH relativeFrom="column">
+              <wp:posOffset>-286689</wp:posOffset>
+            </wp:positionH>
+            <wp:positionV relativeFrom="paragraph">
+              <wp:posOffset>191605</wp:posOffset>
+            </wp:positionV>
+            <wp:extent cx="2428875" cy="2710815"/>
+            <wp:effectExtent l="0" t="0" r="9525" b="0"/>
+            <wp:wrapTopAndBottom/>
+            <wp:docPr id="60342434" name="Picture 1"/>
+            <wp:cNvGraphicFramePr>
+              <a:graphicFrameLocks xmlns:a="http://schemas.openxmlformats.org/drawingml/2006/main" noChangeAspect="1"/>
+            </wp:cNvGraphicFramePr>
+            <a:graphic xmlns:a="http://schemas.openxmlformats.org/drawingml/2006/main">
+              <a:graphicData uri="http://schemas.openxmlformats.org/drawingml/2006/picture">
+                <pic:pic xmlns:pic="http://schemas.openxmlformats.org/drawingml/2006/picture">
+                  <pic:nvPicPr>
+                    <pic:cNvPr id="60342434" name=""/>
+                    <pic:cNvPicPr/>
+                  </pic:nvPicPr>
+                  <pic:blipFill>
+                    <a:blip r:embed="rId16"/>
+                    <a:stretch>
+                      <a:fillRect/>
+                    </a:stretch>
+                  </pic:blipFill>
+                  <pic:spPr>
+                    <a:xfrm>
+                      <a:off x="0" y="0"/>
+                      <a:ext cx="2428875" cy="2710815"/>
+                    </a:xfrm>
+                    <a:prstGeom prst="rect">
+                      <a:avLst/>
+                    </a:prstGeom>
+                  </pic:spPr>
+                </pic:pic>
+              </a:graphicData>
+            </a:graphic>
+            <wp14:sizeRelH relativeFrom="margin">
+              <wp14:pctWidth>0</wp14:pctWidth>
+            </wp14:sizeRelH>
+            <wp14:sizeRelV relativeFrom="margin">
+              <wp14:pctHeight>0</wp14:pctHeight>
+            </wp14:sizeRelV>
+          </wp:anchor>
+        </w:drawing>
+      </w:r>
+    </w:p>
+    <w:p>
+      <w:pPr>
+        <w:rPr>
+          <w:lang w:val="en-US"/>
+        </w:rPr>
+      </w:pPr>
+      <w:r>
+        <w:rPr>
+          <w:lang w:val="en-US"/>
+        </w:rPr>
+        <w:drawing>
+          <wp:anchor distT="0" distB="0" distL="114300" distR="114300" simplePos="0" relativeHeight="251681792" behindDoc="0" locked="0" layoutInCell="1" allowOverlap="1" wp14:anchorId="4961DEB3" wp14:editId="0F828E1A">
+            <wp:simplePos x="0" y="0"/>
+            <wp:positionH relativeFrom="margin">
+              <wp:align>left</wp:align>
+            </wp:positionH>
+            <wp:positionV relativeFrom="paragraph">
+              <wp:posOffset>284480</wp:posOffset>
+            </wp:positionV>
+            <wp:extent cx="2795905" cy="3211830"/>
+            <wp:effectExtent l="0" t="0" r="4445" b="7620"/>
+            <wp:wrapTopAndBottom/>
+            <wp:docPr id="466312791" name="Picture 1"/>
+            <wp:cNvGraphicFramePr>
+              <a:graphicFrameLocks xmlns:a="http://schemas.openxmlformats.org/drawingml/2006/main" noChangeAspect="1"/>
+            </wp:cNvGraphicFramePr>
+            <a:graphic xmlns:a="http://schemas.openxmlformats.org/drawingml/2006/main">
+              <a:graphicData uri="http://schemas.openxmlformats.org/drawingml/2006/picture">
+                <pic:pic xmlns:pic="http://schemas.openxmlformats.org/drawingml/2006/picture">
+                  <pic:nvPicPr>
+                    <pic:cNvPr id="466312791" name=""/>
+                    <pic:cNvPicPr/>
+                  </pic:nvPicPr>
+                  <pic:blipFill>
+                    <a:blip r:embed="rId17"/>
+                    <a:stretch>
+                      <a:fillRect/>
+                    </a:stretch>
+                  </pic:blipFill>
+                  <pic:spPr>
+                    <a:xfrm>
+                      <a:off x="0" y="0"/>
+                      <a:ext cx="2795905" cy="3211830"/>
+                    </a:xfrm>
+                    <a:prstGeom prst="rect">
+                      <a:avLst/>
+                    </a:prstGeom>
+                  </pic:spPr>
+                </pic:pic>
+              </a:graphicData>
+            </a:graphic>
+            <wp14:sizeRelH relativeFrom="margin">
+              <wp14:pctWidth>0</wp14:pctWidth>
+            </wp14:sizeRelH>
+            <wp14:sizeRelV relativeFrom="margin">
+              <wp14:pctHeight>0</wp14:pctHeight>
+            </wp14:sizeRelV>
+          </wp:anchor>
+        </w:drawing>
+      </w:r>
+    </w:p>
+    <w:p>
+      <w:pPr>
+        <w:rPr>
+          <w:lang w:val="en-US"/>
+        </w:rPr>
+      </w:pPr>
+    </w:p>
+    <w:p>
+      <w:pPr>
+        <w:rPr>
+          <w:lang w:val="en-US"/>
+        </w:rPr>
+      </w:pPr>
+    </w:p>
+    <w:p>
+      <w:pPr>
+        <w:rPr>
+          <w:lang w:val="en-US"/>
+        </w:rPr>
+      </w:pPr>
+    </w:p>
+    <w:p>
+      <w:pPr>
+        <w:rPr>
+          <w:lang w:val="en-US"/>
+        </w:rPr>
+      </w:pPr>
+    </w:p>
+    <w:p>
+      <w:pPr>
+        <w:rPr>
+          <w:lang w:val="en-US"/>
+        </w:rPr>
+      </w:pPr>
+    </w:p>
+    <w:p>
+      <w:pPr>
+        <w:rPr>
+          <w:lang w:val="en-US"/>
+        </w:rPr>
+      </w:pPr>
+    </w:p>
+    <w:p>
+      <w:pPr>
+        <w:rPr>
+          <w:lang w:val="en-US"/>
+        </w:rPr>
+      </w:pPr>
+    </w:p>
+    <w:p>
+      <w:pPr>
+        <w:rPr>
+          <w:lang w:val="en-US"/>
+        </w:rPr>
+      </w:pPr>
+    </w:p>
+    <w:p>
+      <w:pPr>
+        <w:rPr>
+          <w:lang w:val="en-US"/>
+        </w:rPr>
+      </w:pPr>
+    </w:p>
+    <w:p>
+      <w:pPr>
+        <w:rPr>
+          <w:lang w:val="en-US"/>
+        </w:rPr>
+      </w:pPr>
+    </w:p>
+    <w:p>
+      <w:pPr>
+        <w:rPr>
+          <w:lang w:val="en-US"/>
+        </w:rPr>
+      </w:pPr>
+    </w:p>
+    <w:p>
+      <w:pPr>
+        <w:rPr>
+          <w:lang w:val="en-US"/>
+        </w:rPr>
+      </w:pPr>
     </w:p>
     <w:p>
       <w:pPr>
@@ -412,6 +945,56 @@
     </w:sectPr>
   </w:body>
 </w:document>
+</file>
+
+<file path=word/endnotes.xml><?xml version="1.0" encoding="utf-8"?>
+<w:endnotes xmlns:wpc="http://schemas.microsoft.com/office/word/2010/wordprocessingCanvas" xmlns:cx="http://schemas.microsoft.com/office/drawing/2014/chartex" xmlns:cx1="http://schemas.microsoft.com/office/drawing/2015/9/8/chartex" xmlns:cx2="http://schemas.microsoft.com/office/drawing/2015/10/21/chartex" xmlns:cx3="http://schemas.microsoft.com/office/drawing/2016/5/9/chartex" xmlns:cx4="http://schemas.microsoft.com/office/drawing/2016/5/10/chartex" xmlns:cx5="http://schemas.microsoft.com/office/drawing/2016/5/11/chartex" xmlns:cx6="http://schemas.microsoft.com/office/drawing/2016/5/12/chartex" xmlns:cx7="http://schemas.microsoft.com/office/drawing/2016/5/13/chartex" xmlns:cx8="http://schemas.microsoft.com/office/drawing/2016/5/14/chartex" xmlns:mc="http://schemas.openxmlformats.org/markup-compatibility/2006" xmlns:aink="http://schemas.microsoft.com/office/drawing/2016/ink" xmlns:am3d="http://schemas.microsoft.com/office/drawing/2017/model3d" xmlns:o="urn:schemas-microsoft-com:office:office" xmlns:oel="http://schemas.microsoft.com/office/2019/extlst" xmlns:r="http://schemas.openxmlformats.org/officeDocument/2006/relationships" xmlns:m="http://schemas.openxmlformats.org/officeDocument/2006/math" xmlns:v="urn:schemas-microsoft-com:vml" xmlns:wp14="http://schemas.microsoft.com/office/word/2010/wordprocessingDrawing" xmlns:wp="http://schemas.openxmlformats.org/drawingml/2006/wordprocessingDrawing" xmlns:w10="urn:schemas-microsoft-com:office:word" xmlns:w="http://schemas.openxmlformats.org/wordprocessingml/2006/main" xmlns:w14="http://schemas.microsoft.com/office/word/2010/wordml" xmlns:w15="http://schemas.microsoft.com/office/word/2012/wordml" xmlns:w16cex="http://schemas.microsoft.com/office/word/2018/wordml/cex" xmlns:w16cid="http://schemas.microsoft.com/office/word/2016/wordml/cid" xmlns:w16="http://schemas.microsoft.com/office/word/2018/wordml" xmlns:w16du="http://schemas.microsoft.com/office/word/2023/wordml/word16du" xmlns:w16sdtdh="http://schemas.microsoft.com/office/word/2020/wordml/sdtdatahash" xmlns:w16sdtfl="http://schemas.microsoft.com/office/word/2024/wordml/sdtformatlock" xmlns:w16se="http://schemas.microsoft.com/office/word/2015/wordml/symex" xmlns:wpg="http://schemas.microsoft.com/office/word/2010/wordprocessingGroup" xmlns:wpi="http://schemas.microsoft.com/office/word/2010/wordprocessingInk" xmlns:wne="http://schemas.microsoft.com/office/word/2006/wordml" xmlns:wps="http://schemas.microsoft.com/office/word/2010/wordprocessingShape" mc:Ignorable="w14 w15 w16se w16cid w16 w16cex w16sdtdh w16sdtfl w16du wp14">
+  <w:endnote w:type="separator" w:id="-1">
+    <w:p>
+      <w:pPr>
+        <w:spacing w:after="0" w:line="240" w:lineRule="auto"/>
+      </w:pPr>
+      <w:r>
+        <w:separator/>
+      </w:r>
+    </w:p>
+  </w:endnote>
+  <w:endnote w:type="continuationSeparator" w:id="0">
+    <w:p>
+      <w:pPr>
+        <w:spacing w:after="0" w:line="240" w:lineRule="auto"/>
+      </w:pPr>
+      <w:r>
+        <w:continuationSeparator/>
+      </w:r>
+    </w:p>
+  </w:endnote>
+</w:endnotes>
+</file>
+
+<file path=word/footnotes.xml><?xml version="1.0" encoding="utf-8"?>
+<w:footnotes xmlns:wpc="http://schemas.microsoft.com/office/word/2010/wordprocessingCanvas" xmlns:cx="http://schemas.microsoft.com/office/drawing/2014/chartex" xmlns:cx1="http://schemas.microsoft.com/office/drawing/2015/9/8/chartex" xmlns:cx2="http://schemas.microsoft.com/office/drawing/2015/10/21/chartex" xmlns:cx3="http://schemas.microsoft.com/office/drawing/2016/5/9/chartex" xmlns:cx4="http://schemas.microsoft.com/office/drawing/2016/5/10/chartex" xmlns:cx5="http://schemas.microsoft.com/office/drawing/2016/5/11/chartex" xmlns:cx6="http://schemas.microsoft.com/office/drawing/2016/5/12/chartex" xmlns:cx7="http://schemas.microsoft.com/office/drawing/2016/5/13/chartex" xmlns:cx8="http://schemas.microsoft.com/office/drawing/2016/5/14/chartex" xmlns:mc="http://schemas.openxmlformats.org/markup-compatibility/2006" xmlns:aink="http://schemas.microsoft.com/office/drawing/2016/ink" xmlns:am3d="http://schemas.microsoft.com/office/drawing/2017/model3d" xmlns:o="urn:schemas-microsoft-com:office:office" xmlns:oel="http://schemas.microsoft.com/office/2019/extlst" xmlns:r="http://schemas.openxmlformats.org/officeDocument/2006/relationships" xmlns:m="http://schemas.openxmlformats.org/officeDocument/2006/math" xmlns:v="urn:schemas-microsoft-com:vml" xmlns:wp14="http://schemas.microsoft.com/office/word/2010/wordprocessingDrawing" xmlns:wp="http://schemas.openxmlformats.org/drawingml/2006/wordprocessingDrawing" xmlns:w10="urn:schemas-microsoft-com:office:word" xmlns:w="http://schemas.openxmlformats.org/wordprocessingml/2006/main" xmlns:w14="http://schemas.microsoft.com/office/word/2010/wordml" xmlns:w15="http://schemas.microsoft.com/office/word/2012/wordml" xmlns:w16cex="http://schemas.microsoft.com/office/word/2018/wordml/cex" xmlns:w16cid="http://schemas.microsoft.com/office/word/2016/wordml/cid" xmlns:w16="http://schemas.microsoft.com/office/word/2018/wordml" xmlns:w16du="http://schemas.microsoft.com/office/word/2023/wordml/word16du" xmlns:w16sdtdh="http://schemas.microsoft.com/office/word/2020/wordml/sdtdatahash" xmlns:w16sdtfl="http://schemas.microsoft.com/office/word/2024/wordml/sdtformatlock" xmlns:w16se="http://schemas.microsoft.com/office/word/2015/wordml/symex" xmlns:wpg="http://schemas.microsoft.com/office/word/2010/wordprocessingGroup" xmlns:wpi="http://schemas.microsoft.com/office/word/2010/wordprocessingInk" xmlns:wne="http://schemas.microsoft.com/office/word/2006/wordml" xmlns:wps="http://schemas.microsoft.com/office/word/2010/wordprocessingShape" mc:Ignorable="w14 w15 w16se w16cid w16 w16cex w16sdtdh w16sdtfl w16du wp14">
+  <w:footnote w:type="separator" w:id="-1">
+    <w:p>
+      <w:pPr>
+        <w:spacing w:after="0" w:line="240" w:lineRule="auto"/>
+      </w:pPr>
+      <w:r>
+        <w:separator/>
+      </w:r>
+    </w:p>
+  </w:footnote>
+  <w:footnote w:type="continuationSeparator" w:id="0">
+    <w:p>
+      <w:pPr>
+        <w:spacing w:after="0" w:line="240" w:lineRule="auto"/>
+      </w:pPr>
+      <w:r>
+        <w:continuationSeparator/>
+      </w:r>
+    </w:p>
+  </w:footnote>
+</w:footnotes>
 </file>
 
 <file path=word/styles.xml><?xml version="1.0" encoding="utf-8"?>
@@ -1349,6 +1932,50 @@
       <w:spacing w:val="5"/>
     </w:rPr>
   </w:style>
+  <w:style w:type="paragraph" w:styleId="Header">
+    <w:name w:val="header"/>
+    <w:basedOn w:val="Normal"/>
+    <w:link w:val="HeaderChar"/>
+    <w:uiPriority w:val="99"/>
+    <w:unhideWhenUsed/>
+    <w:rsid w:val="00584909"/>
+    <w:pPr>
+      <w:tabs>
+        <w:tab w:val="center" w:pos="4513"/>
+        <w:tab w:val="right" w:pos="9026"/>
+      </w:tabs>
+      <w:spacing w:after="0" w:line="240" w:lineRule="auto"/>
+    </w:pPr>
+  </w:style>
+  <w:style w:type="character" w:customStyle="1" w:styleId="HeaderChar">
+    <w:name w:val="Header Char"/>
+    <w:basedOn w:val="DefaultParagraphFont"/>
+    <w:link w:val="Header"/>
+    <w:uiPriority w:val="99"/>
+    <w:rsid w:val="00584909"/>
+  </w:style>
+  <w:style w:type="paragraph" w:styleId="Footer">
+    <w:name w:val="footer"/>
+    <w:basedOn w:val="Normal"/>
+    <w:link w:val="FooterChar"/>
+    <w:uiPriority w:val="99"/>
+    <w:unhideWhenUsed/>
+    <w:rsid w:val="00584909"/>
+    <w:pPr>
+      <w:tabs>
+        <w:tab w:val="center" w:pos="4513"/>
+        <w:tab w:val="right" w:pos="9026"/>
+      </w:tabs>
+      <w:spacing w:after="0" w:line="240" w:lineRule="auto"/>
+    </w:pPr>
+  </w:style>
+  <w:style w:type="character" w:customStyle="1" w:styleId="FooterChar">
+    <w:name w:val="Footer Char"/>
+    <w:basedOn w:val="DefaultParagraphFont"/>
+    <w:link w:val="Footer"/>
+    <w:uiPriority w:val="99"/>
+    <w:rsid w:val="00584909"/>
+  </w:style>
 </w:styles>
 </file>
 

</xml_diff>

<commit_message>
Submitting the lab report for Week_5_lab_report.
</commit_message>
<xml_diff>
--- a/ST2_Week_5_Tutorial_Activities/Week_5_lab_report.docx
+++ b/ST2_Week_5_Tutorial_Activities/Week_5_lab_report.docx
@@ -13,14 +13,28 @@
         <w:rPr>
           <w:lang w:val="en-US"/>
         </w:rPr>
+        <w:t xml:space="preserve">Task 1 </w:t>
+      </w:r>
+    </w:p>
+    <w:p>
+      <w:pPr>
+        <w:rPr>
+          <w:lang w:val="en-US"/>
+        </w:rPr>
+      </w:pPr>
+      <w:r>
+        <w:rPr>
+          <w:noProof/>
+          <w:lang w:val="en-US"/>
+        </w:rPr>
         <w:drawing>
-          <wp:anchor distT="0" distB="0" distL="114300" distR="114300" simplePos="0" relativeHeight="251661312" behindDoc="0" locked="0" layoutInCell="1" allowOverlap="1" wp14:anchorId="1002B889" wp14:editId="787D2AF1">
+          <wp:anchor distT="0" distB="0" distL="114300" distR="114300" simplePos="0" relativeHeight="251661312" behindDoc="0" locked="0" layoutInCell="1" allowOverlap="1" wp14:anchorId="1002B889" wp14:editId="56C2C42E">
             <wp:simplePos x="0" y="0"/>
             <wp:positionH relativeFrom="margin">
-              <wp:posOffset>-190832</wp:posOffset>
+              <wp:align>left</wp:align>
             </wp:positionH>
             <wp:positionV relativeFrom="paragraph">
-              <wp:posOffset>4053095</wp:posOffset>
+              <wp:posOffset>3559313</wp:posOffset>
             </wp:positionV>
             <wp:extent cx="4362674" cy="3829247"/>
             <wp:effectExtent l="0" t="0" r="0" b="0"/>
@@ -59,16 +73,17 @@
       </w:r>
       <w:r>
         <w:rPr>
+          <w:noProof/>
           <w:lang w:val="en-US"/>
         </w:rPr>
         <w:drawing>
-          <wp:anchor distT="0" distB="0" distL="114300" distR="114300" simplePos="0" relativeHeight="251659264" behindDoc="0" locked="0" layoutInCell="1" allowOverlap="1" wp14:anchorId="3580F4C6" wp14:editId="11ECDEA0">
+          <wp:anchor distT="0" distB="0" distL="114300" distR="114300" simplePos="0" relativeHeight="251659264" behindDoc="0" locked="0" layoutInCell="1" allowOverlap="1" wp14:anchorId="3580F4C6" wp14:editId="0EDC93BB">
             <wp:simplePos x="0" y="0"/>
             <wp:positionH relativeFrom="column">
-              <wp:posOffset>-32385</wp:posOffset>
+              <wp:posOffset>47128</wp:posOffset>
             </wp:positionH>
             <wp:positionV relativeFrom="paragraph">
-              <wp:posOffset>427355</wp:posOffset>
+              <wp:posOffset>221671</wp:posOffset>
             </wp:positionV>
             <wp:extent cx="3549650" cy="3200400"/>
             <wp:effectExtent l="0" t="0" r="0" b="0"/>
@@ -105,12 +120,6 @@
           </wp:anchor>
         </w:drawing>
       </w:r>
-      <w:r>
-        <w:rPr>
-          <w:lang w:val="en-US"/>
-        </w:rPr>
-        <w:t xml:space="preserve">Task 1 </w:t>
-      </w:r>
     </w:p>
     <w:p>
       <w:pPr>
@@ -129,6 +138,168 @@
     </w:p>
     <w:p>
       <w:pPr>
+        <w:rPr>
+          <w:rFonts w:asciiTheme="majorHAnsi" w:eastAsiaTheme="majorEastAsia" w:hAnsiTheme="majorHAnsi" w:cstheme="majorBidi"/>
+          <w:color w:val="0F4761" w:themeColor="accent1" w:themeShade="BF"/>
+          <w:sz w:val="32"/>
+          <w:szCs w:val="32"/>
+          <w:lang w:val="en-US"/>
+        </w:rPr>
+      </w:pPr>
+      <w:r>
+        <w:rPr>
+          <w:lang w:val="en-US"/>
+        </w:rPr>
+        <w:br w:type="page"/>
+      </w:r>
+    </w:p>
+    <w:p>
+      <w:pPr>
+        <w:rPr>
+          <w:rFonts w:asciiTheme="majorHAnsi" w:eastAsiaTheme="majorEastAsia" w:hAnsiTheme="majorHAnsi" w:cstheme="majorBidi"/>
+          <w:color w:val="0F4761" w:themeColor="accent1" w:themeShade="BF"/>
+          <w:sz w:val="32"/>
+          <w:szCs w:val="32"/>
+          <w:lang w:val="en-US"/>
+        </w:rPr>
+      </w:pPr>
+      <w:r>
+        <w:rPr>
+          <w:lang w:val="en-US"/>
+        </w:rPr>
+        <w:lastRenderedPageBreak/>
+        <w:t xml:space="preserve">The first test cases that I did to test the </w:t>
+      </w:r>
+      <w:r>
+        <w:rPr>
+          <w:lang w:val="en-US"/>
+        </w:rPr>
+        <w:t xml:space="preserve">Basic </w:t>
+      </w:r>
+      <w:r>
+        <w:rPr>
+          <w:lang w:val="en-US"/>
+        </w:rPr>
+        <w:t>formula</w:t>
+      </w:r>
+      <w:r>
+        <w:rPr>
+          <w:lang w:val="en-US"/>
+        </w:rPr>
+        <w:t>, Fibonacci sequence and the factorial sequences using both iterative and recursive</w:t>
+      </w:r>
+      <w:r>
+        <w:rPr>
+          <w:lang w:val="en-US"/>
+        </w:rPr>
+        <w:t xml:space="preserve"> methods have produced different values in terms of execution. </w:t>
+      </w:r>
+      <w:r>
+        <w:rPr>
+          <w:lang w:val="en-US"/>
+        </w:rPr>
+        <w:t xml:space="preserve">When I used n=5, 10, and 25 all the difference sequences </w:t>
+      </w:r>
+      <w:r>
+        <w:rPr>
+          <w:lang w:val="en-US"/>
+        </w:rPr>
+        <w:t xml:space="preserve">were calculated </w:t>
+      </w:r>
+      <w:proofErr w:type="gramStart"/>
+      <w:r>
+        <w:rPr>
+          <w:lang w:val="en-US"/>
+        </w:rPr>
+        <w:t>quickly</w:t>
+      </w:r>
+      <w:proofErr w:type="gramEnd"/>
+      <w:r>
+        <w:rPr>
+          <w:lang w:val="en-US"/>
+        </w:rPr>
+        <w:t xml:space="preserve"> that I had to show the time up to the 10</w:t>
+      </w:r>
+      <w:r>
+        <w:rPr>
+          <w:vertAlign w:val="superscript"/>
+          <w:lang w:val="en-US"/>
+        </w:rPr>
+        <w:t>th</w:t>
+      </w:r>
+      <w:r>
+        <w:rPr>
+          <w:lang w:val="en-US"/>
+        </w:rPr>
+        <w:t xml:space="preserve"> decimal spot. </w:t>
+      </w:r>
+      <w:proofErr w:type="gramStart"/>
+      <w:r>
+        <w:rPr>
+          <w:lang w:val="en-US"/>
+        </w:rPr>
+        <w:t>However</w:t>
+      </w:r>
+      <w:proofErr w:type="gramEnd"/>
+      <w:r>
+        <w:rPr>
+          <w:lang w:val="en-US"/>
+        </w:rPr>
+        <w:t xml:space="preserve"> when n=25 there was a big lag for the algorithm to calculate </w:t>
+      </w:r>
+      <w:r>
+        <w:rPr>
+          <w:lang w:val="en-US"/>
+        </w:rPr>
+        <w:t xml:space="preserve">Fibonacci and the factorial </w:t>
+      </w:r>
+      <w:r>
+        <w:rPr>
+          <w:lang w:val="en-US"/>
+        </w:rPr>
+        <w:t>algorithm</w:t>
+      </w:r>
+      <w:r>
+        <w:rPr>
+          <w:lang w:val="en-US"/>
+        </w:rPr>
+        <w:t xml:space="preserve"> using both recursive and iterative. This states that both algorithms are suited for large data sets </w:t>
+      </w:r>
+      <w:r>
+        <w:rPr>
+          <w:lang w:val="en-US"/>
+        </w:rPr>
+        <w:t xml:space="preserve">for these sequences. </w:t>
+      </w:r>
+      <w:proofErr w:type="gramStart"/>
+      <w:r>
+        <w:rPr>
+          <w:lang w:val="en-US"/>
+        </w:rPr>
+        <w:t>However</w:t>
+      </w:r>
+      <w:proofErr w:type="gramEnd"/>
+      <w:r>
+        <w:rPr>
+          <w:lang w:val="en-US"/>
+        </w:rPr>
+        <w:t xml:space="preserve"> when I decreased n=20 the code was executed even the Fibonacci and the factorial </w:t>
+      </w:r>
+      <w:r>
+        <w:rPr>
+          <w:lang w:val="en-US"/>
+        </w:rPr>
+        <w:t xml:space="preserve">however as stated in the screenshot it did take longer. </w:t>
+      </w:r>
+      <w:r>
+        <w:rPr>
+          <w:lang w:val="en-US"/>
+        </w:rPr>
+        <w:br w:type="page"/>
+      </w:r>
+    </w:p>
+    <w:p>
+      <w:pPr>
         <w:pStyle w:val="Heading2"/>
         <w:rPr>
           <w:lang w:val="en-US"/>
@@ -136,8 +307,10 @@
       </w:pPr>
       <w:r>
         <w:rPr>
-          <w:lang w:val="en-US"/>
-        </w:rPr>
+          <w:noProof/>
+          <w:lang w:val="en-US"/>
+        </w:rPr>
+        <w:lastRenderedPageBreak/>
         <w:drawing>
           <wp:anchor distT="0" distB="0" distL="114300" distR="114300" simplePos="0" relativeHeight="251663360" behindDoc="0" locked="0" layoutInCell="1" allowOverlap="1" wp14:anchorId="5B5DFBFD" wp14:editId="34A4C1A6">
             <wp:simplePos x="0" y="0"/>
@@ -198,6 +371,83 @@
     </w:p>
     <w:p>
       <w:pPr>
+        <w:rPr>
+          <w:rFonts w:asciiTheme="majorHAnsi" w:eastAsiaTheme="majorEastAsia" w:hAnsiTheme="majorHAnsi" w:cstheme="majorBidi"/>
+          <w:color w:val="0F4761" w:themeColor="accent1" w:themeShade="BF"/>
+          <w:sz w:val="32"/>
+          <w:szCs w:val="32"/>
+          <w:lang w:val="en-US"/>
+        </w:rPr>
+      </w:pPr>
+      <w:r>
+        <w:rPr>
+          <w:lang w:val="en-US"/>
+        </w:rPr>
+        <w:t xml:space="preserve">When it comes to </w:t>
+      </w:r>
+      <w:r>
+        <w:rPr>
+          <w:lang w:val="en-US"/>
+        </w:rPr>
+        <w:t>bigger</w:t>
+      </w:r>
+      <w:r>
+        <w:rPr>
+          <w:lang w:val="en-US"/>
+        </w:rPr>
+        <w:t xml:space="preserve"> data sets you can see the speed </w:t>
+      </w:r>
+      <w:r>
+        <w:rPr>
+          <w:lang w:val="en-US"/>
+        </w:rPr>
+        <w:t>at</w:t>
+      </w:r>
+      <w:r>
+        <w:rPr>
+          <w:lang w:val="en-US"/>
+        </w:rPr>
+        <w:t xml:space="preserve"> which the merge sort does compared to the insertion sort. </w:t>
+      </w:r>
+      <w:r>
+        <w:rPr>
+          <w:lang w:val="en-US"/>
+        </w:rPr>
+        <w:t xml:space="preserve">This is because </w:t>
+      </w:r>
+      <w:r>
+        <w:rPr>
+          <w:lang w:val="en-US"/>
+        </w:rPr>
+        <w:t xml:space="preserve">while </w:t>
+      </w:r>
+      <w:r>
+        <w:rPr>
+          <w:lang w:val="en-US"/>
+        </w:rPr>
+        <w:t>inserting</w:t>
+      </w:r>
+      <w:r>
+        <w:rPr>
+          <w:lang w:val="en-US"/>
+        </w:rPr>
+        <w:t xml:space="preserve"> sort sorts through one digit at a time the merge sort splits the unsorted list and </w:t>
+      </w:r>
+      <w:r>
+        <w:rPr>
+          <w:lang w:val="en-US"/>
+        </w:rPr>
+        <w:t xml:space="preserve">joins it back together while sorting it. This allows multiple sorting actions to take place simultaneously. </w:t>
+      </w:r>
+      <w:r>
+        <w:rPr>
+          <w:lang w:val="en-US"/>
+        </w:rPr>
+        <w:br w:type="page"/>
+      </w:r>
+    </w:p>
+    <w:p>
+      <w:pPr>
         <w:pStyle w:val="Heading2"/>
         <w:rPr>
           <w:lang w:val="en-US"/>
@@ -207,6 +457,7 @@
         <w:rPr>
           <w:lang w:val="en-US"/>
         </w:rPr>
+        <w:lastRenderedPageBreak/>
         <w:t>Task 3</w:t>
       </w:r>
     </w:p>
@@ -216,88 +467,195 @@
           <w:lang w:val="en-US"/>
         </w:rPr>
       </w:pPr>
-    </w:p>
-    <w:p>
-      <w:pPr>
-        <w:rPr>
-          <w:lang w:val="en-US"/>
-        </w:rPr>
-      </w:pPr>
-    </w:p>
-    <w:p>
-      <w:pPr>
-        <w:rPr>
-          <w:lang w:val="en-US"/>
-        </w:rPr>
-      </w:pPr>
-    </w:p>
-    <w:p>
-      <w:pPr>
-        <w:rPr>
-          <w:lang w:val="en-US"/>
-        </w:rPr>
-      </w:pPr>
-    </w:p>
-    <w:p>
-      <w:pPr>
-        <w:rPr>
-          <w:lang w:val="en-US"/>
-        </w:rPr>
-      </w:pPr>
-    </w:p>
-    <w:p>
-      <w:pPr>
-        <w:rPr>
-          <w:lang w:val="en-US"/>
-        </w:rPr>
-      </w:pPr>
-    </w:p>
-    <w:p>
-      <w:pPr>
-        <w:rPr>
-          <w:lang w:val="en-US"/>
-        </w:rPr>
-      </w:pPr>
-    </w:p>
-    <w:p>
-      <w:pPr>
-        <w:rPr>
-          <w:lang w:val="en-US"/>
-        </w:rPr>
-      </w:pPr>
-    </w:p>
-    <w:p>
-      <w:pPr>
-        <w:rPr>
-          <w:lang w:val="en-US"/>
-        </w:rPr>
-      </w:pPr>
-    </w:p>
-    <w:p>
-      <w:pPr>
-        <w:rPr>
-          <w:lang w:val="en-US"/>
-        </w:rPr>
-      </w:pPr>
-    </w:p>
-    <w:p>
-      <w:pPr>
-        <w:rPr>
-          <w:lang w:val="en-US"/>
-        </w:rPr>
-      </w:pPr>
-      <w:r>
-        <w:rPr>
+      <w:r>
+        <w:rPr>
+          <w:noProof/>
           <w:lang w:val="en-US"/>
         </w:rPr>
         <w:drawing>
-          <wp:anchor distT="0" distB="0" distL="114300" distR="114300" simplePos="0" relativeHeight="251665408" behindDoc="0" locked="0" layoutInCell="1" allowOverlap="1" wp14:anchorId="1524DA77" wp14:editId="3D05F620">
+          <wp:anchor distT="0" distB="0" distL="114300" distR="114300" simplePos="0" relativeHeight="251685888" behindDoc="0" locked="0" layoutInCell="1" allowOverlap="1" wp14:anchorId="7180E5AF" wp14:editId="019754DB">
+            <wp:simplePos x="0" y="0"/>
+            <wp:positionH relativeFrom="column">
+              <wp:posOffset>3092009</wp:posOffset>
+            </wp:positionH>
+            <wp:positionV relativeFrom="paragraph">
+              <wp:posOffset>630748</wp:posOffset>
+            </wp:positionV>
+            <wp:extent cx="1892300" cy="844550"/>
+            <wp:effectExtent l="0" t="0" r="0" b="0"/>
+            <wp:wrapNone/>
+            <wp:docPr id="1331251208" name="Picture 1"/>
+            <wp:cNvGraphicFramePr>
+              <a:graphicFrameLocks xmlns:a="http://schemas.openxmlformats.org/drawingml/2006/main" noChangeAspect="1"/>
+            </wp:cNvGraphicFramePr>
+            <a:graphic xmlns:a="http://schemas.openxmlformats.org/drawingml/2006/main">
+              <a:graphicData uri="http://schemas.openxmlformats.org/drawingml/2006/picture">
+                <pic:pic xmlns:pic="http://schemas.openxmlformats.org/drawingml/2006/picture">
+                  <pic:nvPicPr>
+                    <pic:cNvPr id="1331251208" name=""/>
+                    <pic:cNvPicPr/>
+                  </pic:nvPicPr>
+                  <pic:blipFill>
+                    <a:blip r:embed="rId9"/>
+                    <a:stretch>
+                      <a:fillRect/>
+                    </a:stretch>
+                  </pic:blipFill>
+                  <pic:spPr>
+                    <a:xfrm>
+                      <a:off x="0" y="0"/>
+                      <a:ext cx="1892300" cy="844550"/>
+                    </a:xfrm>
+                    <a:prstGeom prst="rect">
+                      <a:avLst/>
+                    </a:prstGeom>
+                  </pic:spPr>
+                </pic:pic>
+              </a:graphicData>
+            </a:graphic>
+          </wp:anchor>
+        </w:drawing>
+      </w:r>
+      <w:r>
+        <w:rPr>
+          <w:noProof/>
+          <w:lang w:val="en-US"/>
+        </w:rPr>
+        <w:drawing>
+          <wp:anchor distT="0" distB="0" distL="114300" distR="114300" simplePos="0" relativeHeight="251683840" behindDoc="0" locked="0" layoutInCell="1" allowOverlap="1" wp14:anchorId="46F37ADE" wp14:editId="5807C3BC">
+            <wp:simplePos x="0" y="0"/>
+            <wp:positionH relativeFrom="column">
+              <wp:posOffset>500933</wp:posOffset>
+            </wp:positionH>
+            <wp:positionV relativeFrom="paragraph">
+              <wp:posOffset>349361</wp:posOffset>
+            </wp:positionV>
+            <wp:extent cx="1816193" cy="1511378"/>
+            <wp:effectExtent l="0" t="0" r="0" b="0"/>
+            <wp:wrapTopAndBottom/>
+            <wp:docPr id="393232386" name="Picture 1"/>
+            <wp:cNvGraphicFramePr>
+              <a:graphicFrameLocks xmlns:a="http://schemas.openxmlformats.org/drawingml/2006/main" noChangeAspect="1"/>
+            </wp:cNvGraphicFramePr>
+            <a:graphic xmlns:a="http://schemas.openxmlformats.org/drawingml/2006/main">
+              <a:graphicData uri="http://schemas.openxmlformats.org/drawingml/2006/picture">
+                <pic:pic xmlns:pic="http://schemas.openxmlformats.org/drawingml/2006/picture">
+                  <pic:nvPicPr>
+                    <pic:cNvPr id="393232386" name=""/>
+                    <pic:cNvPicPr/>
+                  </pic:nvPicPr>
+                  <pic:blipFill>
+                    <a:blip r:embed="rId10"/>
+                    <a:stretch>
+                      <a:fillRect/>
+                    </a:stretch>
+                  </pic:blipFill>
+                  <pic:spPr>
+                    <a:xfrm>
+                      <a:off x="0" y="0"/>
+                      <a:ext cx="1816193" cy="1511378"/>
+                    </a:xfrm>
+                    <a:prstGeom prst="rect">
+                      <a:avLst/>
+                    </a:prstGeom>
+                  </pic:spPr>
+                </pic:pic>
+              </a:graphicData>
+            </a:graphic>
+          </wp:anchor>
+        </w:drawing>
+      </w:r>
+    </w:p>
+    <w:p>
+      <w:pPr>
+        <w:rPr>
+          <w:lang w:val="en-US"/>
+        </w:rPr>
+      </w:pPr>
+      <w:r>
+        <w:rPr>
+          <w:noProof/>
+          <w:lang w:val="en-US"/>
+        </w:rPr>
+        <mc:AlternateContent>
+          <mc:Choice Requires="wps">
+            <w:drawing>
+              <wp:anchor distT="0" distB="0" distL="114300" distR="114300" simplePos="0" relativeHeight="251686912" behindDoc="0" locked="0" layoutInCell="1" allowOverlap="1" wp14:anchorId="25AE70A7" wp14:editId="5796435F">
+                <wp:simplePos x="0" y="0"/>
+                <wp:positionH relativeFrom="column">
+                  <wp:posOffset>190830</wp:posOffset>
+                </wp:positionH>
+                <wp:positionV relativeFrom="paragraph">
+                  <wp:posOffset>1689459</wp:posOffset>
+                </wp:positionV>
+                <wp:extent cx="4891433" cy="7951"/>
+                <wp:effectExtent l="0" t="0" r="23495" b="30480"/>
+                <wp:wrapNone/>
+                <wp:docPr id="555150359" name="Straight Connector 1"/>
+                <wp:cNvGraphicFramePr/>
+                <a:graphic xmlns:a="http://schemas.openxmlformats.org/drawingml/2006/main">
+                  <a:graphicData uri="http://schemas.microsoft.com/office/word/2010/wordprocessingShape">
+                    <wps:wsp>
+                      <wps:cNvCnPr/>
+                      <wps:spPr>
+                        <a:xfrm flipV="1">
+                          <a:off x="0" y="0"/>
+                          <a:ext cx="4891433" cy="7951"/>
+                        </a:xfrm>
+                        <a:prstGeom prst="line">
+                          <a:avLst/>
+                        </a:prstGeom>
+                      </wps:spPr>
+                      <wps:style>
+                        <a:lnRef idx="1">
+                          <a:schemeClr val="accent1"/>
+                        </a:lnRef>
+                        <a:fillRef idx="0">
+                          <a:schemeClr val="accent1"/>
+                        </a:fillRef>
+                        <a:effectRef idx="0">
+                          <a:schemeClr val="accent1"/>
+                        </a:effectRef>
+                        <a:fontRef idx="minor">
+                          <a:schemeClr val="tx1"/>
+                        </a:fontRef>
+                      </wps:style>
+                      <wps:bodyPr/>
+                    </wps:wsp>
+                  </a:graphicData>
+                </a:graphic>
+              </wp:anchor>
+            </w:drawing>
+          </mc:Choice>
+          <mc:Fallback>
+            <w:pict>
+              <v:line w14:anchorId="146CAD13" id="Straight Connector 1" o:spid="_x0000_s1026" style="position:absolute;flip:y;z-index:251686912;visibility:visible;mso-wrap-style:square;mso-wrap-distance-left:9pt;mso-wrap-distance-top:0;mso-wrap-distance-right:9pt;mso-wrap-distance-bottom:0;mso-position-horizontal:absolute;mso-position-horizontal-relative:text;mso-position-vertical:absolute;mso-position-vertical-relative:text" from="15.05pt,133.05pt" to="400.2pt,133.7pt" o:gfxdata="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" strokecolor="#156082 [3204]" strokeweight=".5pt">
+                <v:stroke joinstyle="miter"/>
+              </v:line>
+            </w:pict>
+          </mc:Fallback>
+        </mc:AlternateContent>
+      </w:r>
+    </w:p>
+    <w:p>
+      <w:pPr>
+        <w:rPr>
+          <w:lang w:val="en-US"/>
+        </w:rPr>
+      </w:pPr>
+      <w:r>
+        <w:rPr>
+          <w:noProof/>
+          <w:lang w:val="en-US"/>
+        </w:rPr>
+        <w:drawing>
+          <wp:anchor distT="0" distB="0" distL="114300" distR="114300" simplePos="0" relativeHeight="251665408" behindDoc="0" locked="0" layoutInCell="1" allowOverlap="1" wp14:anchorId="1524DA77" wp14:editId="5DE45181">
             <wp:simplePos x="0" y="0"/>
             <wp:positionH relativeFrom="margin">
-              <wp:posOffset>771001</wp:posOffset>
+              <wp:posOffset>333955</wp:posOffset>
             </wp:positionH>
             <wp:positionV relativeFrom="paragraph">
-              <wp:posOffset>405709</wp:posOffset>
+              <wp:posOffset>240665</wp:posOffset>
             </wp:positionV>
             <wp:extent cx="2209914" cy="1657435"/>
             <wp:effectExtent l="0" t="0" r="0" b="0"/>
@@ -314,7 +672,7 @@
                     <pic:cNvPicPr/>
                   </pic:nvPicPr>
                   <pic:blipFill>
-                    <a:blip r:embed="rId9"/>
+                    <a:blip r:embed="rId11"/>
                     <a:stretch>
                       <a:fillRect/>
                     </a:stretch>
@@ -336,16 +694,80 @@
       </w:r>
       <w:r>
         <w:rPr>
+          <w:noProof/>
           <w:lang w:val="en-US"/>
         </w:rPr>
         <w:drawing>
-          <wp:anchor distT="0" distB="0" distL="114300" distR="114300" simplePos="0" relativeHeight="251669504" behindDoc="1" locked="0" layoutInCell="1" allowOverlap="1" wp14:anchorId="44CC1704" wp14:editId="48ACF41B">
+          <wp:anchor distT="0" distB="0" distL="114300" distR="114300" simplePos="0" relativeHeight="251667456" behindDoc="0" locked="0" layoutInCell="1" allowOverlap="1" wp14:anchorId="139DA39D" wp14:editId="72C6B760">
             <wp:simplePos x="0" y="0"/>
             <wp:positionH relativeFrom="margin">
-              <wp:posOffset>3654839</wp:posOffset>
+              <wp:posOffset>3219423</wp:posOffset>
             </wp:positionH>
             <wp:positionV relativeFrom="paragraph">
-              <wp:posOffset>2016125</wp:posOffset>
+              <wp:posOffset>253945</wp:posOffset>
+            </wp:positionV>
+            <wp:extent cx="1854295" cy="1682836"/>
+            <wp:effectExtent l="0" t="0" r="0" b="0"/>
+            <wp:wrapTopAndBottom/>
+            <wp:docPr id="1666302930" name="Picture 1"/>
+            <wp:cNvGraphicFramePr>
+              <a:graphicFrameLocks xmlns:a="http://schemas.openxmlformats.org/drawingml/2006/main" noChangeAspect="1"/>
+            </wp:cNvGraphicFramePr>
+            <a:graphic xmlns:a="http://schemas.openxmlformats.org/drawingml/2006/main">
+              <a:graphicData uri="http://schemas.openxmlformats.org/drawingml/2006/picture">
+                <pic:pic xmlns:pic="http://schemas.openxmlformats.org/drawingml/2006/picture">
+                  <pic:nvPicPr>
+                    <pic:cNvPr id="1666302930" name=""/>
+                    <pic:cNvPicPr/>
+                  </pic:nvPicPr>
+                  <pic:blipFill>
+                    <a:blip r:embed="rId12"/>
+                    <a:stretch>
+                      <a:fillRect/>
+                    </a:stretch>
+                  </pic:blipFill>
+                  <pic:spPr>
+                    <a:xfrm>
+                      <a:off x="0" y="0"/>
+                      <a:ext cx="1854295" cy="1682836"/>
+                    </a:xfrm>
+                    <a:prstGeom prst="rect">
+                      <a:avLst/>
+                    </a:prstGeom>
+                  </pic:spPr>
+                </pic:pic>
+              </a:graphicData>
+            </a:graphic>
+          </wp:anchor>
+        </w:drawing>
+      </w:r>
+    </w:p>
+    <w:p>
+      <w:pPr>
+        <w:rPr>
+          <w:lang w:val="en-US"/>
+        </w:rPr>
+      </w:pPr>
+    </w:p>
+    <w:p>
+      <w:pPr>
+        <w:rPr>
+          <w:lang w:val="en-US"/>
+        </w:rPr>
+      </w:pPr>
+      <w:r>
+        <w:rPr>
+          <w:noProof/>
+          <w:lang w:val="en-US"/>
+        </w:rPr>
+        <w:drawing>
+          <wp:anchor distT="0" distB="0" distL="114300" distR="114300" simplePos="0" relativeHeight="251669504" behindDoc="1" locked="0" layoutInCell="1" allowOverlap="1" wp14:anchorId="44CC1704" wp14:editId="0B16D0AD">
+            <wp:simplePos x="0" y="0"/>
+            <wp:positionH relativeFrom="margin">
+              <wp:posOffset>3136817</wp:posOffset>
+            </wp:positionH>
+            <wp:positionV relativeFrom="paragraph">
+              <wp:posOffset>8061</wp:posOffset>
             </wp:positionV>
             <wp:extent cx="1949550" cy="882695"/>
             <wp:effectExtent l="0" t="0" r="0" b="0"/>
@@ -362,7 +784,7 @@
                     <pic:cNvPicPr/>
                   </pic:nvPicPr>
                   <pic:blipFill>
-                    <a:blip r:embed="rId10"/>
+                    <a:blip r:embed="rId13"/>
                     <a:stretch>
                       <a:fillRect/>
                     </a:stretch>
@@ -382,53 +804,43 @@
           </wp:anchor>
         </w:drawing>
       </w:r>
-      <w:r>
-        <w:rPr>
-          <w:lang w:val="en-US"/>
-        </w:rPr>
-        <w:drawing>
-          <wp:anchor distT="0" distB="0" distL="114300" distR="114300" simplePos="0" relativeHeight="251667456" behindDoc="0" locked="0" layoutInCell="1" allowOverlap="1" wp14:anchorId="139DA39D" wp14:editId="03F4205B">
-            <wp:simplePos x="0" y="0"/>
-            <wp:positionH relativeFrom="margin">
-              <wp:posOffset>3688991</wp:posOffset>
-            </wp:positionH>
-            <wp:positionV relativeFrom="paragraph">
-              <wp:posOffset>334507</wp:posOffset>
-            </wp:positionV>
-            <wp:extent cx="1854295" cy="1682836"/>
-            <wp:effectExtent l="0" t="0" r="0" b="0"/>
-            <wp:wrapTopAndBottom/>
-            <wp:docPr id="1666302930" name="Picture 1"/>
-            <wp:cNvGraphicFramePr>
-              <a:graphicFrameLocks xmlns:a="http://schemas.openxmlformats.org/drawingml/2006/main" noChangeAspect="1"/>
-            </wp:cNvGraphicFramePr>
-            <a:graphic xmlns:a="http://schemas.openxmlformats.org/drawingml/2006/main">
-              <a:graphicData uri="http://schemas.openxmlformats.org/drawingml/2006/picture">
-                <pic:pic xmlns:pic="http://schemas.openxmlformats.org/drawingml/2006/picture">
-                  <pic:nvPicPr>
-                    <pic:cNvPr id="1666302930" name=""/>
-                    <pic:cNvPicPr/>
-                  </pic:nvPicPr>
-                  <pic:blipFill>
-                    <a:blip r:embed="rId11"/>
-                    <a:stretch>
-                      <a:fillRect/>
-                    </a:stretch>
-                  </pic:blipFill>
-                  <pic:spPr>
-                    <a:xfrm>
-                      <a:off x="0" y="0"/>
-                      <a:ext cx="1854295" cy="1682836"/>
-                    </a:xfrm>
-                    <a:prstGeom prst="rect">
-                      <a:avLst/>
-                    </a:prstGeom>
-                  </pic:spPr>
-                </pic:pic>
-              </a:graphicData>
-            </a:graphic>
-          </wp:anchor>
-        </w:drawing>
+    </w:p>
+    <w:p>
+      <w:pPr>
+        <w:rPr>
+          <w:lang w:val="en-US"/>
+        </w:rPr>
+      </w:pPr>
+    </w:p>
+    <w:p>
+      <w:pPr>
+        <w:rPr>
+          <w:lang w:val="en-US"/>
+        </w:rPr>
+      </w:pPr>
+    </w:p>
+    <w:p>
+      <w:pPr>
+        <w:rPr>
+          <w:lang w:val="en-US"/>
+        </w:rPr>
+      </w:pPr>
+    </w:p>
+    <w:p>
+      <w:pPr>
+        <w:rPr>
+          <w:rFonts w:asciiTheme="majorHAnsi" w:eastAsiaTheme="majorEastAsia" w:hAnsiTheme="majorHAnsi" w:cstheme="majorBidi"/>
+          <w:color w:val="0F4761" w:themeColor="accent1" w:themeShade="BF"/>
+          <w:sz w:val="32"/>
+          <w:szCs w:val="32"/>
+          <w:lang w:val="en-US"/>
+        </w:rPr>
+      </w:pPr>
+      <w:r>
+        <w:rPr>
+          <w:lang w:val="en-US"/>
+        </w:rPr>
+        <w:br w:type="page"/>
       </w:r>
     </w:p>
     <w:p>
@@ -467,6 +879,7 @@
       </w:pPr>
       <w:r>
         <w:rPr>
+          <w:noProof/>
           <w:lang w:val="en-US"/>
         </w:rPr>
         <w:drawing>
@@ -493,7 +906,7 @@
                     <pic:cNvPicPr/>
                   </pic:nvPicPr>
                   <pic:blipFill>
-                    <a:blip r:embed="rId12"/>
+                    <a:blip r:embed="rId14"/>
                     <a:stretch>
                       <a:fillRect/>
                     </a:stretch>
@@ -515,6 +928,7 @@
       </w:r>
       <w:r>
         <w:rPr>
+          <w:noProof/>
           <w:lang w:val="en-US"/>
         </w:rPr>
         <w:drawing>
@@ -541,7 +955,7 @@
                     <pic:cNvPicPr/>
                   </pic:nvPicPr>
                   <pic:blipFill>
-                    <a:blip r:embed="rId13"/>
+                    <a:blip r:embed="rId15"/>
                     <a:stretch>
                       <a:fillRect/>
                     </a:stretch>
@@ -570,6 +984,7 @@
       </w:pPr>
       <w:r>
         <w:rPr>
+          <w:noProof/>
           <w:lang w:val="en-US"/>
         </w:rPr>
         <w:drawing>
@@ -596,7 +1011,7 @@
                     <pic:cNvPicPr/>
                   </pic:nvPicPr>
                   <pic:blipFill>
-                    <a:blip r:embed="rId14"/>
+                    <a:blip r:embed="rId16"/>
                     <a:stretch>
                       <a:fillRect/>
                     </a:stretch>
@@ -671,6 +1086,7 @@
       </w:pPr>
       <w:r>
         <w:rPr>
+          <w:noProof/>
           <w:lang w:val="en-US"/>
         </w:rPr>
         <w:drawing>
@@ -697,7 +1113,7 @@
                     <pic:cNvPicPr/>
                   </pic:nvPicPr>
                   <pic:blipFill>
-                    <a:blip r:embed="rId15"/>
+                    <a:blip r:embed="rId17"/>
                     <a:stretch>
                       <a:fillRect/>
                     </a:stretch>
@@ -732,6 +1148,7 @@
       </w:pPr>
       <w:r>
         <w:rPr>
+          <w:noProof/>
           <w:lang w:val="en-US"/>
         </w:rPr>
         <w:drawing>
@@ -758,7 +1175,7 @@
                     <pic:cNvPicPr/>
                   </pic:nvPicPr>
                   <pic:blipFill>
-                    <a:blip r:embed="rId16"/>
+                    <a:blip r:embed="rId18"/>
                     <a:stretch>
                       <a:fillRect/>
                     </a:stretch>
@@ -793,6 +1210,7 @@
       </w:pPr>
       <w:r>
         <w:rPr>
+          <w:noProof/>
           <w:lang w:val="en-US"/>
         </w:rPr>
         <w:drawing>
@@ -819,7 +1237,7 @@
                     <pic:cNvPicPr/>
                   </pic:nvPicPr>
                   <pic:blipFill>
-                    <a:blip r:embed="rId17"/>
+                    <a:blip r:embed="rId19"/>
                     <a:stretch>
                       <a:fillRect/>
                     </a:stretch>

</xml_diff>